<commit_message>
Rename and complete the general file (Reference)
</commit_message>
<xml_diff>
--- a/Reference/DeviceCluster Class Library API Reference.docx
+++ b/Reference/DeviceCluster Class Library API Reference.docx
@@ -142,6 +142,11 @@
         </w:rPr>
         <w:sectPr>
           <w:footerReference w:type="default" r:id="rId8"/>
+          <w:headerReference w:type="default" r:id="rId12"/>
+          <w:headerReference w:type="first" r:id="rId13"/>
+          <w:footerReference w:type="first" r:id="rId14"/>
+          <w:headerReference w:type="even" r:id="rId15"/>
+          <w:footerReference w:type="even" r:id="rId16"/>
           <w:pgSz w:w="12240" w:h="15840"/>
           <w:pgMar w:top="1440" w:right="1440" w:bottom="1440" w:left="1440" w:header="720" w:footer="720" w:gutter="0"/>
           <w:cols w:space="720"/>
@@ -4600,7 +4605,7 @@
           <w:sz w:val="22"/>
           <w:lang w:val="en-MY"/>
         </w:rPr>
-        <w:t xml:space="preserve">The C# implementation is separated into two main class libraries: </w:t>
+        <w:t>The C# implementation is separated into two main class libraries: XenAnalyticModel.dll  and XenAnalyticDevice.dll . XenAnalyticModel.dll  manages communication between the C# application, SQL Server and the Python prediction layer. XenAnalyticDevice.dll  handles the business rules, including quota allocation, assignment processing and manual-review support. The system can run the Python prediction scripts locally or through an HTTP prediction service, while the main pipeline remains unchanged regardless of the deployment method. The primary entry point is DevicePipeline.RunAsync, which runs the complete process from retrieving project devices and generating predictions to allocating assignments and storing the results in SQL Server.</w:t>
       </w:r>
       <w:r>
         <w:rPr>
@@ -4610,7 +4615,6 @@
           <w:sz w:val="22"/>
           <w:lang w:val="en-MY"/>
         </w:rPr>
-        <w:t xml:space="preserve">XenAnalyticDevice.dll </w:t>
       </w:r>
       <w:r>
         <w:rPr>
@@ -4618,7 +4622,6 @@
           <w:sz w:val="22"/>
           <w:lang w:val="en-MY"/>
         </w:rPr>
-        <w:t xml:space="preserve"> and </w:t>
       </w:r>
       <w:r>
         <w:rPr>
@@ -4628,7 +4631,6 @@
           <w:sz w:val="22"/>
           <w:lang w:val="en-MY"/>
         </w:rPr>
-        <w:t xml:space="preserve">XenAnalyticModel.dll </w:t>
       </w:r>
       <w:r>
         <w:rPr>
@@ -4636,7 +4638,6 @@
           <w:sz w:val="22"/>
           <w:lang w:val="en-MY"/>
         </w:rPr>
-        <w:t xml:space="preserve">. </w:t>
       </w:r>
       <w:r>
         <w:rPr>
@@ -4644,7 +4645,6 @@
           <w:sz w:val="22"/>
           <w:lang w:val="en-MY"/>
         </w:rPr>
-        <w:t xml:space="preserve">XenAnalyticDevice.dll </w:t>
       </w:r>
       <w:r>
         <w:rPr>
@@ -4652,7 +4652,6 @@
           <w:sz w:val="22"/>
           <w:lang w:val="en-MY"/>
         </w:rPr>
-        <w:t xml:space="preserve"> manages communication between the C# application, SQL Server and the Python prediction layer. </w:t>
       </w:r>
       <w:r>
         <w:rPr>
@@ -4660,7 +4659,6 @@
           <w:sz w:val="22"/>
           <w:lang w:val="en-MY"/>
         </w:rPr>
-        <w:t xml:space="preserve">XenAnalyticModel.dll </w:t>
       </w:r>
       <w:r>
         <w:rPr>
@@ -4668,7 +4666,6 @@
           <w:sz w:val="22"/>
           <w:lang w:val="en-MY"/>
         </w:rPr>
-        <w:t xml:space="preserve"> handles the business rules, including quota allocation, assignment processing and manual-review support. The system can run the Python prediction scripts locally or through an HTTP prediction service, while the main pipeline remains unchanged regardless of the deployment method. The primary entry point is </w:t>
       </w:r>
       <w:r>
         <w:rPr>
@@ -4678,7 +4675,6 @@
           <w:sz w:val="22"/>
           <w:lang w:val="en-MY"/>
         </w:rPr>
-        <w:t>DevicePipeline.RunAsync</w:t>
       </w:r>
       <w:r>
         <w:rPr>
@@ -4686,7 +4682,6 @@
           <w:sz w:val="22"/>
           <w:lang w:val="en-MY"/>
         </w:rPr>
-        <w:t>, which runs the complete process from retrieving project devices and generating predictions to allocating assignments and storing the results in SQL Server.</w:t>
       </w:r>
     </w:p>
     <w:p>
@@ -4930,7 +4925,7 @@
                 <w:szCs w:val="20"/>
                 <w:lang w:val="en-MY"/>
               </w:rPr>
-              <w:t xml:space="preserve">XenAnalyticDevice.dll </w:t>
+              <w:t xml:space="preserve">XenAnalyticModel.dll </w:t>
             </w:r>
           </w:p>
         </w:tc>
@@ -5008,7 +5003,7 @@
                 <w:szCs w:val="20"/>
                 <w:lang w:val="en-MY"/>
               </w:rPr>
-              <w:t xml:space="preserve">XenAnalyticModel.dll </w:t>
+              <w:t xml:space="preserve">XenAnalyticDevice.dll </w:t>
             </w:r>
           </w:p>
         </w:tc>
@@ -5261,7 +5256,7 @@
                 <w:szCs w:val="20"/>
                 <w:lang w:val="en-MY"/>
               </w:rPr>
-              <w:t xml:space="preserve">XenAnalyticDevice.dll </w:t>
+              <w:t xml:space="preserve">XenAnalyticModel.dll </w:t>
             </w:r>
           </w:p>
         </w:tc>
@@ -5366,7 +5361,7 @@
                 <w:szCs w:val="20"/>
                 <w:lang w:val="en-MY"/>
               </w:rPr>
-              <w:t xml:space="preserve">XenAnalyticModel.dll </w:t>
+              <w:t xml:space="preserve">XenAnalyticDevice.dll </w:t>
             </w:r>
           </w:p>
         </w:tc>
@@ -5760,7 +5755,7 @@
                 <w:szCs w:val="20"/>
                 <w:lang w:val="en-MY"/>
               </w:rPr>
-              <w:t xml:space="preserve">XenAnalyticDevice.dll </w:t>
+              <w:t xml:space="preserve">XenAnalyticModel.dll </w:t>
             </w:r>
           </w:p>
         </w:tc>
@@ -5864,7 +5859,7 @@
                 <w:szCs w:val="20"/>
                 <w:lang w:val="en-MY"/>
               </w:rPr>
-              <w:t xml:space="preserve">XenAnalyticDevice.dll </w:t>
+              <w:t xml:space="preserve">XenAnalyticModel.dll </w:t>
             </w:r>
           </w:p>
         </w:tc>
@@ -5968,7 +5963,7 @@
                 <w:szCs w:val="20"/>
                 <w:lang w:val="en-MY"/>
               </w:rPr>
-              <w:t xml:space="preserve">XenAnalyticDevice.dll </w:t>
+              <w:t xml:space="preserve">XenAnalyticModel.dll </w:t>
             </w:r>
           </w:p>
         </w:tc>
@@ -6072,7 +6067,7 @@
                 <w:szCs w:val="20"/>
                 <w:lang w:val="en-MY"/>
               </w:rPr>
-              <w:t xml:space="preserve">XenAnalyticModel.dll </w:t>
+              <w:t xml:space="preserve">XenAnalyticDevice.dll </w:t>
             </w:r>
           </w:p>
         </w:tc>
@@ -6176,7 +6171,7 @@
                 <w:szCs w:val="20"/>
                 <w:lang w:val="en-MY"/>
               </w:rPr>
-              <w:t xml:space="preserve">XenAnalyticModel.dll </w:t>
+              <w:t xml:space="preserve">XenAnalyticDevice.dll </w:t>
             </w:r>
           </w:p>
         </w:tc>
@@ -6280,7 +6275,7 @@
                 <w:szCs w:val="20"/>
                 <w:lang w:val="en-MY"/>
               </w:rPr>
-              <w:t xml:space="preserve">XenAnalyticModel.dll </w:t>
+              <w:t xml:space="preserve">XenAnalyticDevice.dll </w:t>
             </w:r>
           </w:p>
         </w:tc>
@@ -6384,7 +6379,7 @@
                 <w:szCs w:val="20"/>
                 <w:lang w:val="en-MY"/>
               </w:rPr>
-              <w:t xml:space="preserve">XenAnalyticModel.dll </w:t>
+              <w:t xml:space="preserve">XenAnalyticDevice.dll </w:t>
             </w:r>
           </w:p>
         </w:tc>
@@ -6527,7 +6522,7 @@
           <w:szCs w:val="18"/>
           <w:lang w:val="en-MY"/>
         </w:rPr>
-        <w:t xml:space="preserve">UI  </w:t>
+        <w:t xml:space="preserve">UI  --&gt; references --&gt;  XenAnalyticDevice.dll   --&gt; depends on--&gt;  XenAnalyticModel.dll </w:t>
       </w:r>
       <w:r>
         <w:rPr>
@@ -6537,7 +6532,6 @@
           <w:szCs w:val="18"/>
           <w:lang w:val="en-MY"/>
         </w:rPr>
-        <w:t xml:space="preserve">--&gt; </w:t>
       </w:r>
       <w:r>
         <w:rPr>
@@ -6547,7 +6541,6 @@
           <w:szCs w:val="18"/>
           <w:lang w:val="en-MY"/>
         </w:rPr>
-        <w:t>references</w:t>
       </w:r>
       <w:r>
         <w:rPr>
@@ -6557,7 +6550,6 @@
           <w:szCs w:val="18"/>
           <w:lang w:val="en-MY"/>
         </w:rPr>
-        <w:t xml:space="preserve"> </w:t>
       </w:r>
       <w:r>
         <w:rPr>
@@ -6567,7 +6559,6 @@
           <w:szCs w:val="18"/>
           <w:lang w:val="en-MY"/>
         </w:rPr>
-        <w:t xml:space="preserve">--&gt;  </w:t>
       </w:r>
       <w:r>
         <w:rPr>
@@ -6577,7 +6568,6 @@
           <w:szCs w:val="18"/>
           <w:lang w:val="en-MY"/>
         </w:rPr>
-        <w:t xml:space="preserve">XenAnalyticModel.dll </w:t>
       </w:r>
       <w:r>
         <w:rPr>
@@ -6587,7 +6577,6 @@
           <w:szCs w:val="18"/>
           <w:lang w:val="en-MY"/>
         </w:rPr>
-        <w:t xml:space="preserve">  --</w:t>
       </w:r>
       <w:r>
         <w:rPr>
@@ -6597,7 +6586,6 @@
           <w:szCs w:val="18"/>
           <w:lang w:val="en-MY"/>
         </w:rPr>
-        <w:t xml:space="preserve">&gt; </w:t>
       </w:r>
       <w:r>
         <w:rPr>
@@ -6607,7 +6595,6 @@
           <w:szCs w:val="18"/>
           <w:lang w:val="en-MY"/>
         </w:rPr>
-        <w:t xml:space="preserve">depends on--&gt;  </w:t>
       </w:r>
       <w:r>
         <w:rPr>
@@ -6617,7 +6604,6 @@
           <w:szCs w:val="18"/>
           <w:lang w:val="en-MY"/>
         </w:rPr>
-        <w:t xml:space="preserve">XenAnalyticDevice.dll </w:t>
       </w:r>
     </w:p>
     <w:p>
@@ -6744,7 +6730,7 @@
           <w:sz w:val="22"/>
           <w:lang w:val="en-MY"/>
         </w:rPr>
-        <w:t xml:space="preserve">Reference </w:t>
+        <w:t>Reference XenAnalyticDevice.dll  only; XenAnalyticModel.dll  is pulled in automatically as a transitive dependency. XenAnalyticModel.dll  has no knowledge of quota allocation or of the output tables. Only three classes in XenAnalyticDevice.dll  reach across into XenAnalyticModel.dll  at all: DevicePipeline, DevicePipelineResult and DevicePipelineCallbacks.</w:t>
       </w:r>
       <w:r>
         <w:rPr>
@@ -6752,7 +6738,6 @@
           <w:sz w:val="22"/>
           <w:lang w:val="en-MY"/>
         </w:rPr>
-        <w:t xml:space="preserve">XenAnalyticModel.dll </w:t>
       </w:r>
       <w:r>
         <w:rPr>
@@ -6760,7 +6745,6 @@
           <w:sz w:val="22"/>
           <w:lang w:val="en-MY"/>
         </w:rPr>
-        <w:t xml:space="preserve"> only; </w:t>
       </w:r>
       <w:r>
         <w:rPr>
@@ -6768,7 +6752,6 @@
           <w:sz w:val="22"/>
           <w:lang w:val="en-MY"/>
         </w:rPr>
-        <w:t xml:space="preserve">XenAnalyticDevice.dll </w:t>
       </w:r>
       <w:r>
         <w:rPr>
@@ -6776,7 +6759,6 @@
           <w:sz w:val="22"/>
           <w:lang w:val="en-MY"/>
         </w:rPr>
-        <w:t xml:space="preserve"> is pulled in automatically as a transitive dependency. </w:t>
       </w:r>
       <w:r>
         <w:rPr>
@@ -6784,7 +6766,6 @@
           <w:sz w:val="22"/>
           <w:lang w:val="en-MY"/>
         </w:rPr>
-        <w:t xml:space="preserve">XenAnalyticDevice.dll </w:t>
       </w:r>
       <w:r>
         <w:rPr>
@@ -6792,7 +6773,6 @@
           <w:sz w:val="22"/>
           <w:lang w:val="en-MY"/>
         </w:rPr>
-        <w:t xml:space="preserve"> has no knowledge of quota allocation or of the output tables. Only three classes in </w:t>
       </w:r>
       <w:r>
         <w:rPr>
@@ -6800,7 +6780,6 @@
           <w:sz w:val="22"/>
           <w:lang w:val="en-MY"/>
         </w:rPr>
-        <w:t xml:space="preserve">XenAnalyticModel.dll </w:t>
       </w:r>
       <w:r>
         <w:rPr>
@@ -6808,7 +6787,6 @@
           <w:sz w:val="22"/>
           <w:lang w:val="en-MY"/>
         </w:rPr>
-        <w:t xml:space="preserve"> reach across into </w:t>
       </w:r>
       <w:r>
         <w:rPr>
@@ -6816,7 +6794,6 @@
           <w:sz w:val="22"/>
           <w:lang w:val="en-MY"/>
         </w:rPr>
-        <w:t xml:space="preserve">XenAnalyticDevice.dll </w:t>
       </w:r>
       <w:r>
         <w:rPr>
@@ -6824,7 +6801,6 @@
           <w:sz w:val="22"/>
           <w:lang w:val="en-MY"/>
         </w:rPr>
-        <w:t xml:space="preserve"> at all: DevicePipeline, DevicePipelineResult and DevicePipelineCallbacks.</w:t>
       </w:r>
     </w:p>
     <w:p>
@@ -7021,7 +6997,7 @@
                 <w:szCs w:val="18"/>
                 <w:lang w:val="en-MY"/>
               </w:rPr>
-              <w:t xml:space="preserve">XenAnalyticDevice.dll </w:t>
+              <w:t xml:space="preserve">XenAnalyticModel.dll </w:t>
             </w:r>
           </w:p>
         </w:tc>
@@ -7099,7 +7075,7 @@
                 <w:szCs w:val="18"/>
                 <w:lang w:val="en-MY"/>
               </w:rPr>
-              <w:t xml:space="preserve">XenAnalyticDevice.dll </w:t>
+              <w:t>XenAnalyticModel.dll  to Python</w:t>
             </w:r>
             <w:r>
               <w:rPr>
@@ -7108,7 +7084,6 @@
                 <w:szCs w:val="18"/>
                 <w:lang w:val="en-MY"/>
               </w:rPr>
-              <w:t xml:space="preserve"> to Python</w:t>
             </w:r>
           </w:p>
         </w:tc>
@@ -7186,7 +7161,7 @@
                 <w:szCs w:val="18"/>
                 <w:lang w:val="en-MY"/>
               </w:rPr>
-              <w:t xml:space="preserve">XenAnalyticDevice.dll </w:t>
+              <w:t>XenAnalyticModel.dll  to Python</w:t>
             </w:r>
             <w:r>
               <w:rPr>
@@ -7195,7 +7170,6 @@
                 <w:szCs w:val="18"/>
                 <w:lang w:val="en-MY"/>
               </w:rPr>
-              <w:t xml:space="preserve"> to Python</w:t>
             </w:r>
           </w:p>
         </w:tc>
@@ -7273,7 +7247,7 @@
                 <w:szCs w:val="18"/>
                 <w:lang w:val="en-MY"/>
               </w:rPr>
-              <w:t xml:space="preserve">XenAnalyticModel.dll </w:t>
+              <w:t xml:space="preserve">XenAnalyticDevice.dll </w:t>
             </w:r>
           </w:p>
         </w:tc>
@@ -7351,7 +7325,7 @@
                 <w:szCs w:val="18"/>
                 <w:lang w:val="en-MY"/>
               </w:rPr>
-              <w:t xml:space="preserve">XenAnalyticModel.dll </w:t>
+              <w:t xml:space="preserve">XenAnalyticDevice.dll </w:t>
             </w:r>
           </w:p>
         </w:tc>
@@ -7429,7 +7403,7 @@
                 <w:szCs w:val="18"/>
                 <w:lang w:val="en-MY"/>
               </w:rPr>
-              <w:t xml:space="preserve">XenAnalyticModel.dll </w:t>
+              <w:t xml:space="preserve">XenAnalyticDevice.dll </w:t>
             </w:r>
           </w:p>
         </w:tc>
@@ -7507,7 +7481,7 @@
                 <w:szCs w:val="18"/>
                 <w:lang w:val="en-MY"/>
               </w:rPr>
-              <w:t xml:space="preserve">XenAnalyticModel.dll </w:t>
+              <w:t xml:space="preserve">XenAnalyticDevice.dll </w:t>
             </w:r>
           </w:p>
         </w:tc>
@@ -9509,7 +9483,7 @@
                 <w:szCs w:val="18"/>
                 <w:lang w:val="en-MY"/>
               </w:rPr>
-              <w:t xml:space="preserve">XenAnalyticModel.dll </w:t>
+              <w:t xml:space="preserve">XenAnalyticDevice.dll </w:t>
             </w:r>
           </w:p>
         </w:tc>
@@ -9593,7 +9567,7 @@
                 <w:szCs w:val="18"/>
                 <w:lang w:val="en-MY"/>
               </w:rPr>
-              <w:t xml:space="preserve">XenAnalyticModel.dll </w:t>
+              <w:t xml:space="preserve">XenAnalyticDevice.dll </w:t>
             </w:r>
           </w:p>
         </w:tc>
@@ -9677,7 +9651,7 @@
                 <w:szCs w:val="18"/>
                 <w:lang w:val="en-MY"/>
               </w:rPr>
-              <w:t xml:space="preserve">XenAnalyticModel.dll </w:t>
+              <w:t xml:space="preserve">XenAnalyticDevice.dll </w:t>
             </w:r>
           </w:p>
         </w:tc>
@@ -9761,7 +9735,7 @@
                 <w:szCs w:val="18"/>
                 <w:lang w:val="en-MY"/>
               </w:rPr>
-              <w:t xml:space="preserve">XenAnalyticDevice.dll </w:t>
+              <w:t xml:space="preserve">XenAnalyticModel.dll </w:t>
             </w:r>
           </w:p>
         </w:tc>
@@ -9845,7 +9819,7 @@
                 <w:szCs w:val="18"/>
                 <w:lang w:val="en-MY"/>
               </w:rPr>
-              <w:t xml:space="preserve">XenAnalyticDevice.dll </w:t>
+              <w:t xml:space="preserve">XenAnalyticModel.dll </w:t>
             </w:r>
           </w:p>
         </w:tc>
@@ -9929,7 +9903,7 @@
                 <w:szCs w:val="18"/>
                 <w:lang w:val="en-MY"/>
               </w:rPr>
-              <w:t xml:space="preserve">XenAnalyticDevice.dll </w:t>
+              <w:t xml:space="preserve">XenAnalyticModel.dll </w:t>
             </w:r>
           </w:p>
         </w:tc>
@@ -10013,7 +9987,7 @@
                 <w:szCs w:val="18"/>
                 <w:lang w:val="en-MY"/>
               </w:rPr>
-              <w:t xml:space="preserve">XenAnalyticDevice.dll </w:t>
+              <w:t xml:space="preserve">XenAnalyticModel.dll </w:t>
             </w:r>
           </w:p>
         </w:tc>
@@ -10097,7 +10071,7 @@
                 <w:szCs w:val="18"/>
                 <w:lang w:val="en-MY"/>
               </w:rPr>
-              <w:t xml:space="preserve">XenAnalyticDevice.dll </w:t>
+              <w:t xml:space="preserve">XenAnalyticModel.dll </w:t>
             </w:r>
           </w:p>
         </w:tc>
@@ -10705,7 +10679,7 @@
           <w:szCs w:val="16"/>
           <w:lang w:val="en-MY"/>
         </w:rPr>
-        <w:t xml:space="preserve">    </w:t>
+        <w:t xml:space="preserve">    XenAnalyticDevice.dll </w:t>
       </w:r>
       <w:r>
         <w:rPr>
@@ -10715,7 +10689,6 @@
           <w:szCs w:val="16"/>
           <w:lang w:val="en-MY"/>
         </w:rPr>
-        <w:t xml:space="preserve">XenAnalyticModel.dll </w:t>
       </w:r>
     </w:p>
     <w:p>
@@ -10739,7 +10712,7 @@
           <w:szCs w:val="16"/>
           <w:lang w:val="en-MY"/>
         </w:rPr>
-        <w:t xml:space="preserve">    </w:t>
+        <w:t xml:space="preserve">    XenAnalyticModel.dll </w:t>
       </w:r>
       <w:r>
         <w:rPr>
@@ -10749,7 +10722,6 @@
           <w:szCs w:val="16"/>
           <w:lang w:val="en-MY"/>
         </w:rPr>
-        <w:t xml:space="preserve">XenAnalyticDevice.dll </w:t>
       </w:r>
     </w:p>
     <w:p>
@@ -13225,7 +13197,7 @@
           <w:sz w:val="18"/>
           <w:lang w:val="en-MY"/>
         </w:rPr>
-        <w:t xml:space="preserve">UI--&gt;  references --&gt; </w:t>
+        <w:t xml:space="preserve">UI--&gt;  references --&gt; XenAnalyticDevice.dll </w:t>
       </w:r>
       <w:r>
         <w:rPr>
@@ -13234,7 +13206,6 @@
           <w:sz w:val="18"/>
           <w:lang w:val="en-MY"/>
         </w:rPr>
-        <w:t xml:space="preserve">XenAnalyticModel.dll </w:t>
       </w:r>
     </w:p>
     <w:p>
@@ -13322,7 +13293,7 @@
           <w:sz w:val="18"/>
           <w:lang w:val="en-MY"/>
         </w:rPr>
-        <w:t xml:space="preserve">                     </w:t>
+        <w:t xml:space="preserve">                     XenAnalyticModel.dll </w:t>
       </w:r>
       <w:r>
         <w:rPr>
@@ -13331,7 +13302,6 @@
           <w:sz w:val="18"/>
           <w:lang w:val="en-MY"/>
         </w:rPr>
-        <w:t xml:space="preserve">XenAnalyticDevice.dll </w:t>
       </w:r>
     </w:p>
     <w:p>
@@ -13523,7 +13493,7 @@
                 <w:noProof/>
                 <w:lang w:val="en-MY"/>
               </w:rPr>
-              <w:t xml:space="preserve">XenAnalyticModel.dll </w:t>
+              <w:t xml:space="preserve">XenAnalyticDevice.dll </w:t>
             </w:r>
           </w:p>
         </w:tc>
@@ -13571,7 +13541,7 @@
                 <w:noProof/>
                 <w:lang w:val="en-MY"/>
               </w:rPr>
-              <w:t xml:space="preserve">XenAnalyticDevice.dll </w:t>
+              <w:t xml:space="preserve">XenAnalyticModel.dll </w:t>
             </w:r>
           </w:p>
         </w:tc>
@@ -13616,7 +13586,7 @@
           <w:noProof/>
           <w:lang w:val="en-MY"/>
         </w:rPr>
-        <w:t xml:space="preserve">XenAnalyticModel.dll </w:t>
+        <w:t>XenAnalyticDevice.dll  depends on XenAnalyticModel.dll , while XenAnalyticModel.dll  does not depend on XenAnalyticDevice.dll . Most of the system flow is coordinated by DevicePipeline</w:t>
       </w:r>
       <w:r>
         <w:rPr>
@@ -13624,7 +13594,6 @@
           <w:noProof/>
           <w:lang w:val="en-MY"/>
         </w:rPr>
-        <w:t xml:space="preserve"> depends on </w:t>
       </w:r>
       <w:r>
         <w:rPr>
@@ -13634,7 +13603,6 @@
           <w:noProof/>
           <w:lang w:val="en-MY"/>
         </w:rPr>
-        <w:t xml:space="preserve">XenAnalyticDevice.dll </w:t>
       </w:r>
       <w:r>
         <w:rPr>
@@ -13642,7 +13610,6 @@
           <w:noProof/>
           <w:lang w:val="en-MY"/>
         </w:rPr>
-        <w:t xml:space="preserve">, while </w:t>
       </w:r>
       <w:r>
         <w:rPr>
@@ -13650,7 +13617,6 @@
           <w:noProof/>
           <w:lang w:val="en-MY"/>
         </w:rPr>
-        <w:t xml:space="preserve">XenAnalyticDevice.dll </w:t>
       </w:r>
       <w:r>
         <w:rPr>
@@ -13658,7 +13624,6 @@
           <w:noProof/>
           <w:lang w:val="en-MY"/>
         </w:rPr>
-        <w:t xml:space="preserve"> does not depend on </w:t>
       </w:r>
       <w:r>
         <w:rPr>
@@ -13666,7 +13631,6 @@
           <w:noProof/>
           <w:lang w:val="en-MY"/>
         </w:rPr>
-        <w:t xml:space="preserve">XenAnalyticModel.dll </w:t>
       </w:r>
       <w:r>
         <w:rPr>
@@ -13674,7 +13638,6 @@
           <w:noProof/>
           <w:lang w:val="en-MY"/>
         </w:rPr>
-        <w:t>. Most of the system flow is coordinated by DevicePipeline</w:t>
       </w:r>
     </w:p>
     <w:p>
@@ -13738,7 +13701,7 @@
           <w:sz w:val="22"/>
           <w:lang w:val="en-MY"/>
         </w:rPr>
-        <w:t xml:space="preserve">XenAnalyticModel.dll </w:t>
+        <w:t xml:space="preserve">XenAnalyticDevice.dll  : </w:t>
       </w:r>
       <w:r>
         <w:rPr>
@@ -13748,7 +13711,6 @@
           <w:sz w:val="22"/>
           <w:lang w:val="en-MY"/>
         </w:rPr>
-        <w:t xml:space="preserve"> : </w:t>
       </w:r>
     </w:p>
     <w:tbl>
@@ -13793,7 +13755,7 @@
                 <w:szCs w:val="18"/>
                 <w:lang w:val="en-MY"/>
               </w:rPr>
-              <w:t>XenAnalyticModel.dll</w:t>
+              <w:t>XenAnalyticDevice.dll Class</w:t>
             </w:r>
             <w:r>
               <w:rPr>
@@ -13804,7 +13766,6 @@
                 <w:szCs w:val="18"/>
                 <w:lang w:val="en-MY"/>
               </w:rPr>
-              <w:t xml:space="preserve"> </w:t>
             </w:r>
             <w:r>
               <w:rPr>
@@ -13815,7 +13776,6 @@
                 <w:szCs w:val="18"/>
                 <w:lang w:val="en-MY"/>
               </w:rPr>
-              <w:t>Class</w:t>
             </w:r>
           </w:p>
         </w:tc>
@@ -14430,21 +14390,19 @@
           <w:noProof/>
           <w:lang w:val="en-MY"/>
         </w:rPr>
-        <w:t xml:space="preserve">The remaining classes in </w:t>
+        <w:t>The remaining classes in XenAnalyticDevice.dll  are primarily result or data structures used by these components.</w:t>
       </w:r>
       <w:r>
         <w:rPr>
           <w:noProof/>
           <w:lang w:val="en-MY"/>
         </w:rPr>
-        <w:t xml:space="preserve">XenAnalyticModel.dll </w:t>
       </w:r>
       <w:r>
         <w:rPr>
           <w:noProof/>
           <w:lang w:val="en-MY"/>
         </w:rPr>
-        <w:t xml:space="preserve"> are primarily result or data structures used by these components.</w:t>
       </w:r>
     </w:p>
     <w:p>
@@ -14465,8 +14423,7 @@
           <w:sz w:val="22"/>
           <w:lang w:val="en-MY"/>
         </w:rPr>
-        <w:lastRenderedPageBreak/>
-        <w:t xml:space="preserve">XenAnalyticDevice.dll </w:t>
+        <w:t xml:space="preserve">XenAnalyticModel.dll  : </w:t>
       </w:r>
       <w:r>
         <w:rPr>
@@ -14476,7 +14433,6 @@
           <w:sz w:val="22"/>
           <w:lang w:val="en-MY"/>
         </w:rPr>
-        <w:t xml:space="preserve"> : </w:t>
       </w:r>
     </w:p>
     <w:tbl>
@@ -14522,7 +14478,7 @@
                 <w:szCs w:val="18"/>
                 <w:lang w:val="en-MY"/>
               </w:rPr>
-              <w:t xml:space="preserve">XenAnalyticDevice.dll </w:t>
+              <w:t>XenAnalyticModel.dll  Class</w:t>
             </w:r>
             <w:r>
               <w:rPr>
@@ -14533,7 +14489,6 @@
                 <w:szCs w:val="18"/>
                 <w:lang w:val="en-MY"/>
               </w:rPr>
-              <w:t xml:space="preserve"> </w:t>
             </w:r>
             <w:r>
               <w:rPr>
@@ -14544,7 +14499,6 @@
                 <w:szCs w:val="18"/>
                 <w:lang w:val="en-MY"/>
               </w:rPr>
-              <w:t>Class</w:t>
             </w:r>
           </w:p>
         </w:tc>
@@ -16151,7 +16105,7 @@
           <w:sz w:val="22"/>
           <w:lang w:val="en-MY"/>
         </w:rPr>
-        <w:t xml:space="preserve">The main dependency direction is one-way. </w:t>
+        <w:t>The main dependency direction is one-way. XenAnalyticDevice.dll  depends on XenAnalyticModel.dll , while XenAnalyticModel.dll  does not depend on XenAnalyticDevice.dll .</w:t>
       </w:r>
       <w:r>
         <w:rPr>
@@ -16159,7 +16113,6 @@
           <w:sz w:val="22"/>
           <w:lang w:val="en-MY"/>
         </w:rPr>
-        <w:t xml:space="preserve">XenAnalyticModel.dll </w:t>
       </w:r>
       <w:r>
         <w:rPr>
@@ -16167,7 +16120,6 @@
           <w:sz w:val="22"/>
           <w:lang w:val="en-MY"/>
         </w:rPr>
-        <w:t xml:space="preserve"> depends on </w:t>
       </w:r>
       <w:r>
         <w:rPr>
@@ -16175,7 +16127,6 @@
           <w:sz w:val="22"/>
           <w:lang w:val="en-MY"/>
         </w:rPr>
-        <w:t xml:space="preserve">XenAnalyticDevice.dll </w:t>
       </w:r>
       <w:r>
         <w:rPr>
@@ -16183,7 +16134,6 @@
           <w:sz w:val="22"/>
           <w:lang w:val="en-MY"/>
         </w:rPr>
-        <w:t xml:space="preserve">, while </w:t>
       </w:r>
       <w:r>
         <w:rPr>
@@ -16191,7 +16141,6 @@
           <w:sz w:val="22"/>
           <w:lang w:val="en-MY"/>
         </w:rPr>
-        <w:t xml:space="preserve">XenAnalyticDevice.dll </w:t>
       </w:r>
       <w:r>
         <w:rPr>
@@ -16199,7 +16148,6 @@
           <w:sz w:val="22"/>
           <w:lang w:val="en-MY"/>
         </w:rPr>
-        <w:t xml:space="preserve"> does not depend on </w:t>
       </w:r>
       <w:r>
         <w:rPr>
@@ -16207,7 +16155,6 @@
           <w:sz w:val="22"/>
           <w:lang w:val="en-MY"/>
         </w:rPr>
-        <w:t xml:space="preserve">XenAnalyticModel.dll </w:t>
       </w:r>
       <w:r>
         <w:rPr>
@@ -16215,7 +16162,6 @@
           <w:sz w:val="22"/>
           <w:lang w:val="en-MY"/>
         </w:rPr>
-        <w:t>.</w:t>
       </w:r>
     </w:p>
     <w:p>
@@ -16254,7 +16200,7 @@
           <w:highlight w:val="lightGray"/>
           <w:lang w:val="en-MY"/>
         </w:rPr>
-        <w:t xml:space="preserve">UI  →  </w:t>
+        <w:t>UI  →  XenAnalyticDevice.dll   →  XenAnalyticModel.dll   →  SQL Server / Python Prediction</w:t>
       </w:r>
       <w:r>
         <w:rPr>
@@ -16264,7 +16210,6 @@
           <w:highlight w:val="lightGray"/>
           <w:lang w:val="en-MY"/>
         </w:rPr>
-        <w:t xml:space="preserve">XenAnalyticModel.dll </w:t>
       </w:r>
       <w:r>
         <w:rPr>
@@ -16274,7 +16219,6 @@
           <w:highlight w:val="lightGray"/>
           <w:lang w:val="en-MY"/>
         </w:rPr>
-        <w:t xml:space="preserve">  →  </w:t>
       </w:r>
       <w:r>
         <w:rPr>
@@ -16284,7 +16228,6 @@
           <w:highlight w:val="lightGray"/>
           <w:lang w:val="en-MY"/>
         </w:rPr>
-        <w:t xml:space="preserve">XenAnalyticDevice.dll </w:t>
       </w:r>
       <w:r>
         <w:rPr>
@@ -16294,7 +16237,6 @@
           <w:highlight w:val="lightGray"/>
           <w:lang w:val="en-MY"/>
         </w:rPr>
-        <w:t xml:space="preserve">  →  SQL Server / Python Prediction</w:t>
       </w:r>
     </w:p>
     <w:p>
@@ -16450,7 +16392,7 @@
                 <w:sz w:val="18"/>
                 <w:lang w:val="en-MY"/>
               </w:rPr>
-              <w:t xml:space="preserve">XenAnalyticModel.dll </w:t>
+              <w:t xml:space="preserve">XenAnalyticDevice.dll </w:t>
             </w:r>
           </w:p>
         </w:tc>
@@ -16519,7 +16461,7 @@
                 <w:sz w:val="18"/>
                 <w:lang w:val="en-MY"/>
               </w:rPr>
-              <w:t xml:space="preserve">XenAnalyticModel.dll </w:t>
+              <w:t xml:space="preserve">XenAnalyticDevice.dll </w:t>
             </w:r>
           </w:p>
         </w:tc>
@@ -16588,7 +16530,7 @@
                 <w:sz w:val="18"/>
                 <w:lang w:val="en-MY"/>
               </w:rPr>
-              <w:t xml:space="preserve">XenAnalyticModel.dll </w:t>
+              <w:t xml:space="preserve">XenAnalyticDevice.dll </w:t>
             </w:r>
           </w:p>
         </w:tc>
@@ -16657,7 +16599,7 @@
                 <w:sz w:val="18"/>
                 <w:lang w:val="en-MY"/>
               </w:rPr>
-              <w:t xml:space="preserve">XenAnalyticModel.dll </w:t>
+              <w:t xml:space="preserve">XenAnalyticDevice.dll </w:t>
             </w:r>
           </w:p>
         </w:tc>
@@ -16726,7 +16668,7 @@
                 <w:sz w:val="18"/>
                 <w:lang w:val="en-MY"/>
               </w:rPr>
-              <w:t xml:space="preserve">XenAnalyticModel.dll </w:t>
+              <w:t xml:space="preserve">XenAnalyticDevice.dll </w:t>
             </w:r>
           </w:p>
         </w:tc>
@@ -16795,7 +16737,7 @@
                 <w:sz w:val="18"/>
                 <w:lang w:val="en-MY"/>
               </w:rPr>
-              <w:t xml:space="preserve">XenAnalyticDevice.dll </w:t>
+              <w:t xml:space="preserve">XenAnalyticModel.dll </w:t>
             </w:r>
           </w:p>
         </w:tc>
@@ -16864,7 +16806,7 @@
                 <w:sz w:val="18"/>
                 <w:lang w:val="en-MY"/>
               </w:rPr>
-              <w:t xml:space="preserve">XenAnalyticDevice.dll </w:t>
+              <w:t xml:space="preserve">XenAnalyticModel.dll </w:t>
             </w:r>
           </w:p>
         </w:tc>
@@ -16933,7 +16875,7 @@
                 <w:sz w:val="18"/>
                 <w:lang w:val="en-MY"/>
               </w:rPr>
-              <w:t xml:space="preserve">XenAnalyticDevice.dll </w:t>
+              <w:t xml:space="preserve">XenAnalyticModel.dll </w:t>
             </w:r>
           </w:p>
         </w:tc>
@@ -17002,7 +16944,7 @@
                 <w:sz w:val="18"/>
                 <w:lang w:val="en-MY"/>
               </w:rPr>
-              <w:t xml:space="preserve">XenAnalyticDevice.dll </w:t>
+              <w:t xml:space="preserve">XenAnalyticModel.dll </w:t>
             </w:r>
           </w:p>
         </w:tc>
@@ -17279,7 +17221,7 @@
                 <w:sz w:val="19"/>
                 <w:lang w:val="en-MY"/>
               </w:rPr>
-              <w:t>XenAnalyticModel.dll</w:t>
+              <w:t>XenAnalyticDevice.dll</w:t>
             </w:r>
           </w:p>
         </w:tc>
@@ -17395,7 +17337,7 @@
                 <w:sz w:val="19"/>
                 <w:lang w:val="en-MY"/>
               </w:rPr>
-              <w:t>XenAnalyticModel.dll</w:t>
+              <w:t>XenAnalyticDevice.dll</w:t>
             </w:r>
           </w:p>
         </w:tc>
@@ -17511,7 +17453,7 @@
                 <w:sz w:val="19"/>
                 <w:lang w:val="en-MY"/>
               </w:rPr>
-              <w:t>XenAnalyticModel.dll</w:t>
+              <w:t>XenAnalyticDevice.dll</w:t>
             </w:r>
           </w:p>
         </w:tc>
@@ -17627,7 +17569,7 @@
                 <w:sz w:val="19"/>
                 <w:lang w:val="en-MY"/>
               </w:rPr>
-              <w:t>XenAnalyticModel.dll</w:t>
+              <w:t>XenAnalyticDevice.dll</w:t>
             </w:r>
           </w:p>
         </w:tc>
@@ -17743,7 +17685,7 @@
                 <w:sz w:val="19"/>
                 <w:lang w:val="en-MY"/>
               </w:rPr>
-              <w:t>XenAnalyticModel.dll</w:t>
+              <w:t>XenAnalyticDevice.dll</w:t>
             </w:r>
           </w:p>
         </w:tc>
@@ -17859,7 +17801,7 @@
                 <w:sz w:val="19"/>
                 <w:lang w:val="en-MY"/>
               </w:rPr>
-              <w:t>XenAnalyticModel.dll</w:t>
+              <w:t>XenAnalyticDevice.dll</w:t>
             </w:r>
           </w:p>
         </w:tc>
@@ -17975,7 +17917,7 @@
                 <w:sz w:val="19"/>
                 <w:lang w:val="en-MY"/>
               </w:rPr>
-              <w:t>XenAnalyticModel.dll</w:t>
+              <w:t>XenAnalyticDevice.dll</w:t>
             </w:r>
           </w:p>
         </w:tc>
@@ -18091,7 +18033,7 @@
                 <w:sz w:val="19"/>
                 <w:lang w:val="en-MY"/>
               </w:rPr>
-              <w:t>XenAnalyticModel.dll</w:t>
+              <w:t>XenAnalyticDevice.dll</w:t>
             </w:r>
           </w:p>
         </w:tc>
@@ -18207,7 +18149,7 @@
                 <w:sz w:val="19"/>
                 <w:lang w:val="en-MY"/>
               </w:rPr>
-              <w:t>XenAnalyticModel.dll</w:t>
+              <w:t>XenAnalyticDevice.dll</w:t>
             </w:r>
           </w:p>
         </w:tc>
@@ -18323,7 +18265,7 @@
                 <w:sz w:val="19"/>
                 <w:lang w:val="en-MY"/>
               </w:rPr>
-              <w:t>XenAnalyticModel.dll</w:t>
+              <w:t>XenAnalyticDevice.dll</w:t>
             </w:r>
           </w:p>
         </w:tc>
@@ -18439,7 +18381,7 @@
                 <w:sz w:val="19"/>
                 <w:lang w:val="en-MY"/>
               </w:rPr>
-              <w:t>XenAnalyticModel.dll</w:t>
+              <w:t>XenAnalyticDevice.dll</w:t>
             </w:r>
           </w:p>
         </w:tc>
@@ -18555,7 +18497,7 @@
                 <w:sz w:val="19"/>
                 <w:lang w:val="en-MY"/>
               </w:rPr>
-              <w:t>XenAnalyticModel.dll</w:t>
+              <w:t>XenAnalyticDevice.dll</w:t>
             </w:r>
           </w:p>
         </w:tc>
@@ -18671,7 +18613,7 @@
                 <w:sz w:val="19"/>
                 <w:lang w:val="en-MY"/>
               </w:rPr>
-              <w:t>XenAnalyticModel.dll</w:t>
+              <w:t>XenAnalyticDevice.dll</w:t>
             </w:r>
           </w:p>
         </w:tc>
@@ -18787,7 +18729,7 @@
                 <w:sz w:val="19"/>
                 <w:lang w:val="en-MY"/>
               </w:rPr>
-              <w:t>XenAnalyticModel.dll</w:t>
+              <w:t>XenAnalyticDevice.dll</w:t>
             </w:r>
           </w:p>
         </w:tc>
@@ -18903,7 +18845,7 @@
                 <w:sz w:val="19"/>
                 <w:lang w:val="en-MY"/>
               </w:rPr>
-              <w:t>XenAnalyticModel.dll</w:t>
+              <w:t>XenAnalyticDevice.dll</w:t>
             </w:r>
           </w:p>
         </w:tc>
@@ -19019,7 +18961,7 @@
                 <w:sz w:val="19"/>
                 <w:lang w:val="en-MY"/>
               </w:rPr>
-              <w:t>XenAnalyticModel.dll</w:t>
+              <w:t>XenAnalyticDevice.dll</w:t>
             </w:r>
           </w:p>
         </w:tc>
@@ -19135,7 +19077,7 @@
                 <w:sz w:val="19"/>
                 <w:lang w:val="en-MY"/>
               </w:rPr>
-              <w:t>XenAnalyticModel.dll</w:t>
+              <w:t>XenAnalyticDevice.dll</w:t>
             </w:r>
           </w:p>
         </w:tc>
@@ -19251,7 +19193,7 @@
                 <w:sz w:val="19"/>
                 <w:lang w:val="en-MY"/>
               </w:rPr>
-              <w:t>XenAnalyticModel.dll</w:t>
+              <w:t>XenAnalyticDevice.dll</w:t>
             </w:r>
           </w:p>
         </w:tc>
@@ -19367,7 +19309,7 @@
                 <w:sz w:val="19"/>
                 <w:lang w:val="en-MY"/>
               </w:rPr>
-              <w:t>XenAnalyticDevice.dll</w:t>
+              <w:t>XenAnalyticModel.dll</w:t>
             </w:r>
           </w:p>
         </w:tc>
@@ -19483,7 +19425,7 @@
                 <w:sz w:val="19"/>
                 <w:lang w:val="en-MY"/>
               </w:rPr>
-              <w:t>XenAnalyticDevice.dll</w:t>
+              <w:t>XenAnalyticModel.dll</w:t>
             </w:r>
           </w:p>
         </w:tc>
@@ -19599,7 +19541,7 @@
                 <w:sz w:val="19"/>
                 <w:lang w:val="en-MY"/>
               </w:rPr>
-              <w:t>XenAnalyticDevice.dll</w:t>
+              <w:t>XenAnalyticModel.dll</w:t>
             </w:r>
           </w:p>
         </w:tc>
@@ -19715,7 +19657,7 @@
                 <w:sz w:val="19"/>
                 <w:lang w:val="en-MY"/>
               </w:rPr>
-              <w:t>XenAnalyticDevice.dll</w:t>
+              <w:t>XenAnalyticModel.dll</w:t>
             </w:r>
           </w:p>
         </w:tc>
@@ -19831,7 +19773,7 @@
                 <w:sz w:val="19"/>
                 <w:lang w:val="en-MY"/>
               </w:rPr>
-              <w:t>XenAnalyticDevice.dll</w:t>
+              <w:t>XenAnalyticModel.dll</w:t>
             </w:r>
           </w:p>
         </w:tc>
@@ -19947,7 +19889,7 @@
                 <w:sz w:val="19"/>
                 <w:lang w:val="en-MY"/>
               </w:rPr>
-              <w:t>XenAnalyticDevice.dll</w:t>
+              <w:t>XenAnalyticModel.dll</w:t>
             </w:r>
           </w:p>
         </w:tc>
@@ -20063,7 +20005,7 @@
                 <w:sz w:val="19"/>
                 <w:lang w:val="en-MY"/>
               </w:rPr>
-              <w:t>XenAnalyticDevice.dll</w:t>
+              <w:t>XenAnalyticModel.dll</w:t>
             </w:r>
           </w:p>
         </w:tc>
@@ -20179,7 +20121,7 @@
                 <w:sz w:val="19"/>
                 <w:lang w:val="en-MY"/>
               </w:rPr>
-              <w:t>XenAnalyticDevice.dll</w:t>
+              <w:t>XenAnalyticModel.dll</w:t>
             </w:r>
           </w:p>
         </w:tc>
@@ -20295,7 +20237,7 @@
                 <w:sz w:val="19"/>
                 <w:lang w:val="en-MY"/>
               </w:rPr>
-              <w:t>XenAnalyticDevice.dll</w:t>
+              <w:t>XenAnalyticModel.dll</w:t>
             </w:r>
           </w:p>
         </w:tc>
@@ -20411,7 +20353,7 @@
                 <w:sz w:val="19"/>
                 <w:lang w:val="en-MY"/>
               </w:rPr>
-              <w:t>XenAnalyticDevice.dll</w:t>
+              <w:t>XenAnalyticModel.dll</w:t>
             </w:r>
           </w:p>
         </w:tc>
@@ -20527,7 +20469,7 @@
                 <w:sz w:val="19"/>
                 <w:lang w:val="en-MY"/>
               </w:rPr>
-              <w:t>XenAnalyticDevice.dll</w:t>
+              <w:t>XenAnalyticModel.dll</w:t>
             </w:r>
           </w:p>
         </w:tc>
@@ -20643,7 +20585,7 @@
                 <w:sz w:val="19"/>
                 <w:lang w:val="en-MY"/>
               </w:rPr>
-              <w:t>XenAnalyticDevice.dll</w:t>
+              <w:t>XenAnalyticModel.dll</w:t>
             </w:r>
           </w:p>
         </w:tc>
@@ -20759,7 +20701,7 @@
                 <w:sz w:val="19"/>
                 <w:lang w:val="en-MY"/>
               </w:rPr>
-              <w:t>XenAnalyticDevice.dll</w:t>
+              <w:t>XenAnalyticModel.dll</w:t>
             </w:r>
           </w:p>
         </w:tc>
@@ -20878,7 +20820,7 @@
                 <w:sz w:val="19"/>
                 <w:lang w:val="en-MY"/>
               </w:rPr>
-              <w:t>XenAnalyticDevice.dll</w:t>
+              <w:t>XenAnalyticModel.dll</w:t>
             </w:r>
           </w:p>
         </w:tc>
@@ -21721,7 +21663,7 @@
           <w:color w:val="auto"/>
           <w:lang w:val="en-MY"/>
         </w:rPr>
-        <w:t>5.1  XenAnalyticDevice.dll</w:t>
+        <w:t>5.1  XenAnalyticModel.dll</w:t>
       </w:r>
       <w:bookmarkEnd w:id="34"/>
     </w:p>
@@ -21790,7 +21732,7 @@
           <w:noProof/>
           <w:lang w:val="en-MY"/>
         </w:rPr>
-        <w:t>Namespace: Model.Services   ·   Library: XenAnalyticDevice.dll</w:t>
+        <w:t>Namespace: Model.Services   ·   Library: XenAnalyticModel.dll</w:t>
       </w:r>
     </w:p>
     <w:tbl>
@@ -24837,7 +24779,7 @@
           <w:sz w:val="19"/>
           <w:lang w:val="en-MY"/>
         </w:rPr>
-        <w:t>Namespace: Model.Services   ·   Library: XenAnalyticDevice.dll</w:t>
+        <w:t>Namespace: Model.Services   ·   Library: XenAnalyticModel.dll</w:t>
       </w:r>
     </w:p>
     <w:p>
@@ -26057,7 +25999,7 @@
           <w:sz w:val="19"/>
           <w:lang w:val="en-MY"/>
         </w:rPr>
-        <w:t>Namespace: Model.Services   ·   Library: XenAnalyticDevice.dll</w:t>
+        <w:t>Namespace: Model.Services   ·   Library: XenAnalyticModel.dll</w:t>
       </w:r>
     </w:p>
     <w:p>
@@ -27318,7 +27260,7 @@
           <w:sz w:val="19"/>
           <w:lang w:val="en-MY"/>
         </w:rPr>
-        <w:t>Namespace: Model.Services   ·   Library: XenAnalyticDevice.dll</w:t>
+        <w:t>Namespace: Model.Services   ·   Library: XenAnalyticModel.dll</w:t>
       </w:r>
     </w:p>
     <w:p>
@@ -27833,8 +27775,7 @@
           <w:color w:val="auto"/>
           <w:lang w:val="en-MY"/>
         </w:rPr>
-        <w:lastRenderedPageBreak/>
-        <w:t>5.2  XenAnalyticModel.dll</w:t>
+        <w:t>5.2  XenAnalyticDevice.dll</w:t>
       </w:r>
       <w:bookmarkEnd w:id="39"/>
     </w:p>
@@ -27905,7 +27846,7 @@
           <w:sz w:val="19"/>
           <w:lang w:val="en-MY"/>
         </w:rPr>
-        <w:t>Namespace: Logic   ·   Library: XenAnalyticModel.dll</w:t>
+        <w:t>Namespace: Logic   ·   Library: XenAnalyticDevice.dll</w:t>
       </w:r>
     </w:p>
     <w:p>
@@ -28496,7 +28437,7 @@
           <w:sz w:val="19"/>
           <w:lang w:val="en-MY"/>
         </w:rPr>
-        <w:t>Namespace: Logic   ·   Library: XenAnalyticModel.dll</w:t>
+        <w:t>Namespace: Logic   ·   Library: XenAnalyticDevice.dll</w:t>
       </w:r>
     </w:p>
     <w:p>
@@ -30554,7 +30495,7 @@
           <w:sz w:val="19"/>
           <w:lang w:val="en-MY"/>
         </w:rPr>
-        <w:t>Namespace: Logic   ·   Library: XenAnalyticModel.dll</w:t>
+        <w:t>Namespace: Logic   ·   Library: XenAnalyticDevice.dll</w:t>
       </w:r>
     </w:p>
     <w:p>
@@ -31280,8 +31221,7 @@
           <w:sz w:val="19"/>
           <w:lang w:val="en-MY"/>
         </w:rPr>
-        <w:lastRenderedPageBreak/>
-        <w:t>Namespace: Logic   ·   Library: XenAnalyticModel.dll</w:t>
+        <w:t>Namespace: Logic   ·   Library: XenAnalyticDevice.dll</w:t>
       </w:r>
     </w:p>
     <w:p>
@@ -31787,7 +31727,7 @@
           <w:sz w:val="19"/>
           <w:lang w:val="en-MY"/>
         </w:rPr>
-        <w:t>Namespace: Logic.SimilarityScore   ·   Library: XenAnalyticModel.dll</w:t>
+        <w:t>Namespace: Logic.SimilarityScore   ·   Library: XenAnalyticDevice.dll</w:t>
       </w:r>
     </w:p>
     <w:p>
@@ -32836,7 +32776,7 @@
           <w:sz w:val="19"/>
           <w:lang w:val="en-MY"/>
         </w:rPr>
-        <w:t>Namespace: Logic   ·   Library: XenAnalyticModel.dll</w:t>
+        <w:t>Namespace: Logic   ·   Library: XenAnalyticDevice.dll</w:t>
       </w:r>
     </w:p>
     <w:p>
@@ -33249,6 +33189,26 @@
 </w:ftr>
 </file>
 
+<file path=word/footer2.xml><?xml version="1.0" encoding="utf-8"?>
+<w:ftr xmlns:m="http://schemas.openxmlformats.org/officeDocument/2006/math" xmlns:mc="http://schemas.openxmlformats.org/markup-compatibility/2006" xmlns:mo="http://schemas.microsoft.com/office/mac/office/2008/main" xmlns:mv="urn:schemas-microsoft-com:mac:vml" xmlns:o="urn:schemas-microsoft-com:office:office" xmlns:r="http://schemas.openxmlformats.org/officeDocument/2006/relationships" xmlns:v="urn:schemas-microsoft-com:vml" xmlns:w10="urn:schemas-microsoft-com:office:word" xmlns:w14="http://schemas.microsoft.com/office/word/2010/wordml" xmlns:w="http://schemas.openxmlformats.org/wordprocessingml/2006/main" xmlns:wne="http://schemas.microsoft.com/office/word/2006/wordml" xmlns:wp14="http://schemas.microsoft.com/office/word/2010/wordprocessingDrawing" xmlns:wp="http://schemas.openxmlformats.org/drawingml/2006/wordprocessingDrawing" xmlns:wpc="http://schemas.microsoft.com/office/word/2010/wordprocessingCanvas" xmlns:wpg="http://schemas.microsoft.com/office/word/2010/wordprocessingGroup" xmlns:wpi="http://schemas.microsoft.com/office/word/2010/wordprocessingInk" xmlns:wps="http://schemas.microsoft.com/office/word/2010/wordprocessingShape" mc:Ignorable="w14 wp14">
+  <w:p>
+    <w:pPr>
+      <w:pStyle w:val="Footer"/>
+    </w:pPr>
+  </w:p>
+</w:ftr>
+</file>
+
+<file path=word/footer3.xml><?xml version="1.0" encoding="utf-8"?>
+<w:ftr xmlns:m="http://schemas.openxmlformats.org/officeDocument/2006/math" xmlns:mc="http://schemas.openxmlformats.org/markup-compatibility/2006" xmlns:mo="http://schemas.microsoft.com/office/mac/office/2008/main" xmlns:mv="urn:schemas-microsoft-com:mac:vml" xmlns:o="urn:schemas-microsoft-com:office:office" xmlns:r="http://schemas.openxmlformats.org/officeDocument/2006/relationships" xmlns:v="urn:schemas-microsoft-com:vml" xmlns:w10="urn:schemas-microsoft-com:office:word" xmlns:w14="http://schemas.microsoft.com/office/word/2010/wordml" xmlns:w="http://schemas.openxmlformats.org/wordprocessingml/2006/main" xmlns:wne="http://schemas.microsoft.com/office/word/2006/wordml" xmlns:wp14="http://schemas.microsoft.com/office/word/2010/wordprocessingDrawing" xmlns:wp="http://schemas.openxmlformats.org/drawingml/2006/wordprocessingDrawing" xmlns:wpc="http://schemas.microsoft.com/office/word/2010/wordprocessingCanvas" xmlns:wpg="http://schemas.microsoft.com/office/word/2010/wordprocessingGroup" xmlns:wpi="http://schemas.microsoft.com/office/word/2010/wordprocessingInk" xmlns:wps="http://schemas.microsoft.com/office/word/2010/wordprocessingShape" mc:Ignorable="w14 wp14">
+  <w:p>
+    <w:pPr>
+      <w:pStyle w:val="Footer"/>
+    </w:pPr>
+  </w:p>
+</w:ftr>
+</file>
+
 <file path=word/footnotes.xml><?xml version="1.0" encoding="utf-8"?>
 <w:footnotes xmlns:wpc="http://schemas.microsoft.com/office/word/2010/wordprocessingCanvas" xmlns:cx="http://schemas.microsoft.com/office/drawing/2014/chartex" xmlns:cx1="http://schemas.microsoft.com/office/drawing/2015/9/8/chartex" xmlns:cx2="http://schemas.microsoft.com/office/drawing/2015/10/21/chartex" xmlns:cx3="http://schemas.microsoft.com/office/drawing/2016/5/9/chartex" xmlns:cx4="http://schemas.microsoft.com/office/drawing/2016/5/10/chartex" xmlns:cx5="http://schemas.microsoft.com/office/drawing/2016/5/11/chartex" xmlns:cx6="http://schemas.microsoft.com/office/drawing/2016/5/12/chartex" xmlns:cx7="http://schemas.microsoft.com/office/drawing/2016/5/13/chartex" xmlns:cx8="http://schemas.microsoft.com/office/drawing/2016/5/14/chartex" xmlns:mc="http://schemas.openxmlformats.org/markup-compatibility/2006" xmlns:aink="http://schemas.microsoft.com/office/drawing/2016/ink" xmlns:am3d="http://schemas.microsoft.com/office/drawing/2017/model3d" xmlns:o="urn:schemas-microsoft-com:office:office" xmlns:oel="http://schemas.microsoft.com/office/2019/extlst" xmlns:r="http://schemas.openxmlformats.org/officeDocument/2006/relationships" xmlns:m="http://schemas.openxmlformats.org/officeDocument/2006/math" xmlns:v="urn:schemas-microsoft-com:vml" xmlns:wp14="http://schemas.microsoft.com/office/word/2010/wordprocessingDrawing" xmlns:wp="http://schemas.openxmlformats.org/drawingml/2006/wordprocessingDrawing" xmlns:w10="urn:schemas-microsoft-com:office:word" xmlns:w="http://schemas.openxmlformats.org/wordprocessingml/2006/main" xmlns:w14="http://schemas.microsoft.com/office/word/2010/wordml" xmlns:w15="http://schemas.microsoft.com/office/word/2012/wordml" xmlns:w16cex="http://schemas.microsoft.com/office/word/2018/wordml/cex" xmlns:w16cid="http://schemas.microsoft.com/office/word/2016/wordml/cid" xmlns:w16="http://schemas.microsoft.com/office/word/2018/wordml" xmlns:w16du="http://schemas.microsoft.com/office/word/2023/wordml/word16du" xmlns:w16sdtdh="http://schemas.microsoft.com/office/word/2020/wordml/sdtdatahash" xmlns:w16sdtfl="http://schemas.microsoft.com/office/word/2024/wordml/sdtformatlock" xmlns:w16se="http://schemas.microsoft.com/office/word/2015/wordml/symex" xmlns:wpg="http://schemas.microsoft.com/office/word/2010/wordprocessingGroup" xmlns:wpi="http://schemas.microsoft.com/office/word/2010/wordprocessingInk" xmlns:wne="http://schemas.microsoft.com/office/word/2006/wordml" xmlns:wps="http://schemas.microsoft.com/office/word/2010/wordprocessingShape" mc:Ignorable="w14 w15 w16se w16cid w16 w16cex w16sdtdh w16sdtfl w16du wp14">
   <w:footnote w:type="separator" w:id="-1">
@@ -33272,6 +33232,36 @@
     </w:p>
   </w:footnote>
 </w:footnotes>
+</file>
+
+<file path=word/header1.xml><?xml version="1.0" encoding="utf-8"?>
+<w:hdr xmlns:m="http://schemas.openxmlformats.org/officeDocument/2006/math" xmlns:mc="http://schemas.openxmlformats.org/markup-compatibility/2006" xmlns:mo="http://schemas.microsoft.com/office/mac/office/2008/main" xmlns:mv="urn:schemas-microsoft-com:mac:vml" xmlns:o="urn:schemas-microsoft-com:office:office" xmlns:r="http://schemas.openxmlformats.org/officeDocument/2006/relationships" xmlns:v="urn:schemas-microsoft-com:vml" xmlns:w10="urn:schemas-microsoft-com:office:word" xmlns:w14="http://schemas.microsoft.com/office/word/2010/wordml" xmlns:w="http://schemas.openxmlformats.org/wordprocessingml/2006/main" xmlns:wne="http://schemas.microsoft.com/office/word/2006/wordml" xmlns:wp14="http://schemas.microsoft.com/office/word/2010/wordprocessingDrawing" xmlns:wp="http://schemas.openxmlformats.org/drawingml/2006/wordprocessingDrawing" xmlns:wpc="http://schemas.microsoft.com/office/word/2010/wordprocessingCanvas" xmlns:wpg="http://schemas.microsoft.com/office/word/2010/wordprocessingGroup" xmlns:wpi="http://schemas.microsoft.com/office/word/2010/wordprocessingInk" xmlns:wps="http://schemas.microsoft.com/office/word/2010/wordprocessingShape" mc:Ignorable="w14 wp14">
+  <w:p>
+    <w:pPr>
+      <w:pStyle w:val="Header"/>
+    </w:pPr>
+  </w:p>
+</w:hdr>
+</file>
+
+<file path=word/header2.xml><?xml version="1.0" encoding="utf-8"?>
+<w:hdr xmlns:m="http://schemas.openxmlformats.org/officeDocument/2006/math" xmlns:mc="http://schemas.openxmlformats.org/markup-compatibility/2006" xmlns:mo="http://schemas.microsoft.com/office/mac/office/2008/main" xmlns:mv="urn:schemas-microsoft-com:mac:vml" xmlns:o="urn:schemas-microsoft-com:office:office" xmlns:r="http://schemas.openxmlformats.org/officeDocument/2006/relationships" xmlns:v="urn:schemas-microsoft-com:vml" xmlns:w10="urn:schemas-microsoft-com:office:word" xmlns:w14="http://schemas.microsoft.com/office/word/2010/wordml" xmlns:w="http://schemas.openxmlformats.org/wordprocessingml/2006/main" xmlns:wne="http://schemas.microsoft.com/office/word/2006/wordml" xmlns:wp14="http://schemas.microsoft.com/office/word/2010/wordprocessingDrawing" xmlns:wp="http://schemas.openxmlformats.org/drawingml/2006/wordprocessingDrawing" xmlns:wpc="http://schemas.microsoft.com/office/word/2010/wordprocessingCanvas" xmlns:wpg="http://schemas.microsoft.com/office/word/2010/wordprocessingGroup" xmlns:wpi="http://schemas.microsoft.com/office/word/2010/wordprocessingInk" xmlns:wps="http://schemas.microsoft.com/office/word/2010/wordprocessingShape" mc:Ignorable="w14 wp14">
+  <w:p>
+    <w:pPr>
+      <w:pStyle w:val="Header"/>
+    </w:pPr>
+  </w:p>
+</w:hdr>
+</file>
+
+<file path=word/header3.xml><?xml version="1.0" encoding="utf-8"?>
+<w:hdr xmlns:m="http://schemas.openxmlformats.org/officeDocument/2006/math" xmlns:mc="http://schemas.openxmlformats.org/markup-compatibility/2006" xmlns:mo="http://schemas.microsoft.com/office/mac/office/2008/main" xmlns:mv="urn:schemas-microsoft-com:mac:vml" xmlns:o="urn:schemas-microsoft-com:office:office" xmlns:r="http://schemas.openxmlformats.org/officeDocument/2006/relationships" xmlns:v="urn:schemas-microsoft-com:vml" xmlns:w10="urn:schemas-microsoft-com:office:word" xmlns:w14="http://schemas.microsoft.com/office/word/2010/wordml" xmlns:w="http://schemas.openxmlformats.org/wordprocessingml/2006/main" xmlns:wne="http://schemas.microsoft.com/office/word/2006/wordml" xmlns:wp14="http://schemas.microsoft.com/office/word/2010/wordprocessingDrawing" xmlns:wp="http://schemas.openxmlformats.org/drawingml/2006/wordprocessingDrawing" xmlns:wpc="http://schemas.microsoft.com/office/word/2010/wordprocessingCanvas" xmlns:wpg="http://schemas.microsoft.com/office/word/2010/wordprocessingGroup" xmlns:wpi="http://schemas.microsoft.com/office/word/2010/wordprocessingInk" xmlns:wps="http://schemas.microsoft.com/office/word/2010/wordprocessingShape" mc:Ignorable="w14 wp14">
+  <w:p>
+    <w:pPr>
+      <w:pStyle w:val="Header"/>
+    </w:pPr>
+  </w:p>
+</w:hdr>
 </file>
 
 <file path=word/numbering.xml><?xml version="1.0" encoding="utf-8"?>

</xml_diff>